<commit_message>
feat: simplify firmware and update project reports
Aligns the EGA, EGB and CIE documentation with the verified seven-task firmware, periodic protection and final operating ranges.
</commit_message>
<xml_diff>
--- a/2_egb/1_informes/Informe_CIE.docx
+++ b/2_egb/1_informes/Informe_CIE.docx
@@ -161,13 +161,13 @@
         <w:pStyle w:val="RTCuerpo"/>
       </w:pPr>
       <w:r>
-        <w:t>El ADS1115 digitaliza las tensiones de salida y el ADC interno mide las señales acondicio</w:t>
+        <w:t xml:space="preserve">El ADS1115 digitaliza las tensiones de salida y el ADC interno mide las señales acondicionadas de corriente y la tensión de entrada. Las conversiones se calibran con las relaciones obtenidas experimentalmente. La tarea protection_task lee Vin, I- e I+ cada 1 ms; si una corriente alcanza su límite, enclava la falla, deshabilita la rama y lleva su PWM a cero. La sobretensión se comprueba durante la adquisición del ADS1115 y también mantiene la salida apagada hasta recibir RESET.</w:t>
       </w:r>
       <w:r>
-        <w:t>nadas de corriente y la tensión de entrada. Las conversiones de corriente se calibraron mediante tablas obtenidas experimentalmente; para la tensión se aplicó una corrección lineal de dos puntos. La protección rápida de sobrecorriente se inicia desde la in</w:t>
+        <w:t/>
       </w:r>
       <w:r>
-        <w:t>terrupción del ADC y fuerza el PWM a cero cuando la muestra supera el umbral. La tarea de protección confirma y enclava las fallas de sobrecorriente u sobretensión, dejando la salida deshabilitada hasta recibir RESET.</w:t>
+        <w:t/>
       </w:r>
     </w:p>
     <w:p>
@@ -354,7 +354,7 @@
                 <w:color w:val="191919"/>
                 <w:sz w:val="16"/>
               </w:rPr>
-              <w:t>0 a 30 V por rama; paso de 0,5 V</w:t>
+              <w:t xml:space="preserve">0 a 30 V por rama; paso de 0,5 V; valor inicial de 5 V</w:t>
             </w:r>
           </w:p>
         </w:tc>
@@ -907,7 +907,7 @@
         <w:pStyle w:val="RTCuerpo"/>
       </w:pPr>
       <w:r>
-        <w:t>El firmware se organiza en siete tareas: protection_task, adc_task, dos instancias de control_task, encoder_task, uart_task y display_task. protection_task selecciona en forma secuencial Vin, I− e I+ en el ADC interno, descarta dos conversiones luego de cada cambio de canal, promedia cuatro muestras válidas y supervisa la corriente y la caída rápida de Vin. adc_task lee las tensiones con el ADS1115 y publica el conjunto calibrado. Las dos instancias de control ejecutan los reguladores PI de las ramas positiva y negativa. El bus I²C se protege con un mutex, mientras que la instantánea compartida se copia dentro de secciones críticas breves. La interrupción del FIFO del ADC lleva inmediatamente a cero el PWM afectado ante sobrecorriente; la tarea de protección completa después el enclavamiento y la indicación de la falla. La memoria flash guarda consignas y límites únicamente por orden SAVE y con ambas salidas apagadas.</w:t>
+        <w:t xml:space="preserve">El firmware se organiza en siete tareas: protection_task, adc_task, dos instancias de control_task, encoder_task, uart_task y display_task. protection_task posee la máxima prioridad y, cada 1 ms, realiza una lectura directa de Vin, I- e I+ con el ADC interno, compara las corrientes con sus límites y enclava las fallas. adc_task adquiere V+ y V- mediante el ADS1115, aplica las calibraciones y promedia cada lectura nueva con la anterior antes de publicar las mediciones. Las dos instancias de control ejecutan los reguladores PI de las ramas positiva y negativa. El bus I2C se protege con un mutex y las tareas copian únicamente los datos compartidos que necesitan dentro de secciones críticas breves. encoder_task contiene directamente la selección y el ajuste de tensión, límite de corriente y límite de sobretensión. La memoria flash guarda consignas y límites sólo por orden SAVE y con ambas salidas apagadas.</w:t>
       </w:r>
     </w:p>
     <w:p>
@@ -3545,7 +3545,7 @@
         <w:pStyle w:val="RTCuerpo"/>
       </w:pPr>
       <w:r>
-        <w:t>Se obtuvo una fuente partida funcional con regulación independiente, medición local, límites configurables y protecciones enclavadas. La organización en siete tareas de FreeRTOS separa la adquisición, la protección rápida, los dos controles, la interfaz local, la pantalla y la comunicación. La EGB extendió el prototipo mediante un controlador Linux, una consola y una interfaz web sin alterar el lazo temporal crítico. Las pruebas confirmaron la comunicación UART, el control remoto de ambas ramas, errores inferiores a 0,10 V y 10 mA en los puntos calibrados, y el funcionamiento simultáneo a 5,00 V por rama con un rendimiento total calculado cercano al 53 %.</w:t>
+        <w:t xml:space="preserve">Se obtuvo una fuente partida funcional con regulación independiente, medición local, límites configurables y protecciones enclavadas. La organización en siete tareas de FreeRTOS separa la adquisición, la protección periódica de 1 ms, los dos controles, la interfaz local, la pantalla y la comunicación. La EGB extendió el prototipo mediante un controlador Linux, una consola y una interfaz web sin alterar el lazo temporal crítico. Las pruebas confirmaron la comunicación UART, el control remoto de ambas ramas, errores inferiores a 0,10 V y 10 mA en los puntos calibrados, y el funcionamiento simultáneo a 5,00 V por rama con un rendimiento total calculado cercano al 53 %.</w:t>
       </w:r>
     </w:p>
     <w:p>

</xml_diff>